<commit_message>
Redited .docx and pdf file
</commit_message>
<xml_diff>
--- a/Documents/Core java output.docx
+++ b/Documents/Core java output.docx
@@ -675,6 +675,103 @@
                     <a:xfrm>
                       <a:off x="0" y="0"/>
                       <a:ext cx="4077269" cy="981212"/>
+                    </a:xfrm>
+                    <a:prstGeom prst="rect">
+                      <a:avLst/>
+                    </a:prstGeom>
+                  </pic:spPr>
+                </pic:pic>
+              </a:graphicData>
+            </a:graphic>
+          </wp:inline>
+        </w:drawing>
+      </w:r>
+    </w:p>
+    <w:p>
+      <w:r>
+        <w:rPr>
+          <w:noProof/>
+        </w:rPr>
+        <w:drawing>
+          <wp:inline distT="0" distB="0" distL="0" distR="0">
+            <wp:extent cx="5943600" cy="3234055"/>
+            <wp:effectExtent l="0" t="0" r="0" b="4445"/>
+            <wp:docPr id="1" name="Picture 1"/>
+            <wp:cNvGraphicFramePr>
+              <a:graphicFrameLocks xmlns:a="http://schemas.openxmlformats.org/drawingml/2006/main" noChangeAspect="1"/>
+            </wp:cNvGraphicFramePr>
+            <a:graphic xmlns:a="http://schemas.openxmlformats.org/drawingml/2006/main">
+              <a:graphicData uri="http://schemas.openxmlformats.org/drawingml/2006/picture">
+                <pic:pic xmlns:pic="http://schemas.openxmlformats.org/drawingml/2006/picture">
+                  <pic:nvPicPr>
+                    <pic:cNvPr id="1" name="E982189.tmp"/>
+                    <pic:cNvPicPr/>
+                  </pic:nvPicPr>
+                  <pic:blipFill>
+                    <a:blip r:embed="rId19">
+                      <a:extLst>
+                        <a:ext uri="{28A0092B-C50C-407E-A947-70E740481C1C}">
+                          <a14:useLocalDpi xmlns:a14="http://schemas.microsoft.com/office/drawing/2010/main" val="0"/>
+                        </a:ext>
+                      </a:extLst>
+                    </a:blip>
+                    <a:stretch>
+                      <a:fillRect/>
+                    </a:stretch>
+                  </pic:blipFill>
+                  <pic:spPr>
+                    <a:xfrm>
+                      <a:off x="0" y="0"/>
+                      <a:ext cx="5943600" cy="3234055"/>
+                    </a:xfrm>
+                    <a:prstGeom prst="rect">
+                      <a:avLst/>
+                    </a:prstGeom>
+                  </pic:spPr>
+                </pic:pic>
+              </a:graphicData>
+            </a:graphic>
+          </wp:inline>
+        </w:drawing>
+      </w:r>
+    </w:p>
+    <w:p>
+      <w:r>
+        <w:rPr>
+          <w:noProof/>
+        </w:rPr>
+        <w:lastRenderedPageBreak/>
+        <w:drawing>
+          <wp:inline distT="0" distB="0" distL="0" distR="0">
+            <wp:extent cx="5943600" cy="3136900"/>
+            <wp:effectExtent l="0" t="0" r="0" b="6350"/>
+            <wp:docPr id="2" name="Picture 2"/>
+            <wp:cNvGraphicFramePr>
+              <a:graphicFrameLocks xmlns:a="http://schemas.openxmlformats.org/drawingml/2006/main" noChangeAspect="1"/>
+            </wp:cNvGraphicFramePr>
+            <a:graphic xmlns:a="http://schemas.openxmlformats.org/drawingml/2006/main">
+              <a:graphicData uri="http://schemas.openxmlformats.org/drawingml/2006/picture">
+                <pic:pic xmlns:pic="http://schemas.openxmlformats.org/drawingml/2006/picture">
+                  <pic:nvPicPr>
+                    <pic:cNvPr id="2" name="E98FAAF.tmp"/>
+                    <pic:cNvPicPr/>
+                  </pic:nvPicPr>
+                  <pic:blipFill>
+                    <a:blip r:embed="rId20">
+                      <a:extLst>
+                        <a:ext uri="{28A0092B-C50C-407E-A947-70E740481C1C}">
+                          <a14:useLocalDpi xmlns:a14="http://schemas.microsoft.com/office/drawing/2010/main" val="0"/>
+                        </a:ext>
+                      </a:extLst>
+                    </a:blip>
+                    <a:stretch>
+                      <a:fillRect/>
+                    </a:stretch>
+                  </pic:blipFill>
+                  <pic:spPr>
+                    <a:xfrm>
+                      <a:off x="0" y="0"/>
+                      <a:ext cx="5943600" cy="3136900"/>
                     </a:xfrm>
                     <a:prstGeom prst="rect">
                       <a:avLst/>
@@ -1389,7 +1486,7 @@
 </file>
 
 <file path=customXml/itemProps1.xml><?xml version="1.0" encoding="utf-8"?>
-<ds:datastoreItem xmlns:ds="http://schemas.openxmlformats.org/officeDocument/2006/customXml" ds:itemID="{E2CA301C-0904-49F1-AB32-99D4F41AA5B1}">
+<ds:datastoreItem xmlns:ds="http://schemas.openxmlformats.org/officeDocument/2006/customXml" ds:itemID="{05C2AEAF-A948-48EF-B9C7-E7C33A5A8225}">
   <ds:schemaRefs>
     <ds:schemaRef ds:uri="http://schemas.openxmlformats.org/officeDocument/2006/bibliography"/>
   </ds:schemaRefs>

</xml_diff>